<commit_message>
Insert the funding statement in both manuscripts
Supplied by an author, which is the condition this section was waiting on. The
placeholder that printed in bold on the Applied Energy submission is gone, and
the long paper, which carried no funding section at all, now has one before its
data-availability statement.

Both render the Polish l with stroke and the degree sign correctly under
pdflatex, verified on the page rather than through pdftotext, which cannot
extract either from this font encoding and reports them as plain characters.

The Applied Energy paper previously carried this same grant number with no
author behind it, and it was removed then as an unsourced claim. It is
reinstated because an author has now given the wording.
</commit_message>
<xml_diff>
--- a/paper/ae_submission/V5.docx
+++ b/paper/ae_submission/V5.docx
@@ -18732,11 +18732,9 @@
       <w:r>
         <w:rPr>
           <w:rFonts w:ascii="Times New Roman" w:hAnsi="Times New Roman"/>
-          <w:b/>
-          <w:bCs/>
-          <w:sz w:val="24"/>
-        </w:rPr>
-        <w:t xml:space="preserve">[FUNDING STATEMENT TO BE INSERTED BY THE AUTHORS BEFORE SUBMISSION.]</w:t>
+          <w:sz w:val="24"/>
+        </w:rPr>
+        <w:t xml:space="preserve">This project has received funding from the European Union’s Horizon 2020 research and innovation programme under the Marie Skłodowska-Curie grant agreement N° 945363.</w:t>
       </w:r>
     </w:p>
     <w:bookmarkEnd w:id="55"/>

</xml_diff>